<commit_message>
Update license guide for desktop manager
</commit_message>
<xml_diff>
--- a/Documentation/Watchdog_License_Activation_Guide.docx
+++ b/Documentation/Watchdog_License_Activation_Guide.docx
@@ -554,7 +554,7 @@
           <w:rFonts w:ascii="Arial" w:hAnsi="Arial"/>
           <w:sz w:val="21"/>
         </w:rPr>
-        <w:t>Complete these steps only on the protected MicroBrain development PC that holds the private signing key.</w:t>
+        <w:t>Complete these steps only on the protected MicroBrain licensing PC that holds the private signing key.</w:t>
       </w:r>
     </w:p>
     <w:p>
@@ -567,7 +567,7 @@
           <w:rFonts w:ascii="Arial" w:hAnsi="Arial"/>
           <w:sz w:val="21"/>
         </w:rPr>
-        <w:t>Open Windows PowerShell.</w:t>
+        <w:t>Double-click Watchdog License Manager on the Windows Desktop.</w:t>
       </w:r>
     </w:p>
     <w:p>
@@ -580,7 +580,115 @@
           <w:rFonts w:ascii="Arial" w:hAnsi="Arial"/>
           <w:sz w:val="21"/>
         </w:rPr>
-        <w:t>Change to the Watchdog source-project folder:</w:t>
+        <w:t>Enter the customer, mall, or company name in Customer name.</w:t>
+      </w:r>
+    </w:p>
+    <w:p>
+      <w:pPr>
+        <w:pStyle w:val="ListNumber"/>
+        <w:spacing w:after="120"/>
+      </w:pPr>
+      <w:r>
+        <w:rPr>
+          <w:rFonts w:ascii="Arial" w:hAnsi="Arial"/>
+          <w:sz w:val="21"/>
+        </w:rPr>
+        <w:t>Paste the complete Installation ID copied from the customer's Watchdog PC.</w:t>
+      </w:r>
+    </w:p>
+    <w:p>
+      <w:pPr>
+        <w:pStyle w:val="ListNumber"/>
+        <w:spacing w:after="120"/>
+      </w:pPr>
+      <w:r>
+        <w:rPr>
+          <w:rFonts w:ascii="Arial" w:hAnsi="Arial"/>
+          <w:sz w:val="21"/>
+        </w:rPr>
+        <w:t>Select the purchased meter capacity. Licenses are issued in blocks of 50 meters.</w:t>
+      </w:r>
+    </w:p>
+    <w:p>
+      <w:pPr>
+        <w:pStyle w:val="ListNumber"/>
+        <w:spacing w:after="120"/>
+      </w:pPr>
+      <w:r>
+        <w:rPr>
+          <w:rFonts w:ascii="Arial" w:hAnsi="Arial"/>
+          <w:sz w:val="21"/>
+        </w:rPr>
+        <w:t>Keep Commercial as the standard edition, unless the customer purchased another edition.</w:t>
+      </w:r>
+    </w:p>
+    <w:p>
+      <w:pPr>
+        <w:pStyle w:val="ListNumber"/>
+        <w:spacing w:after="120"/>
+      </w:pPr>
+      <w:r>
+        <w:rPr>
+          <w:rFonts w:ascii="Arial" w:hAnsi="Arial"/>
+          <w:sz w:val="21"/>
+        </w:rPr>
+        <w:t>For a permanent license, leave License expires clear. For a time-limited license, select License expires and choose the final valid date.</w:t>
+      </w:r>
+    </w:p>
+    <w:p>
+      <w:pPr>
+        <w:pStyle w:val="ListNumber"/>
+        <w:spacing w:after="120"/>
+      </w:pPr>
+      <w:r>
+        <w:rPr>
+          <w:rFonts w:ascii="Arial" w:hAnsi="Arial"/>
+          <w:sz w:val="21"/>
+        </w:rPr>
+        <w:t>Confirm that Private key points to watchdog-license-private.pem. The application normally selects it automatically.</w:t>
+      </w:r>
+    </w:p>
+    <w:p>
+      <w:pPr>
+        <w:pStyle w:val="ListNumber"/>
+        <w:spacing w:after="120"/>
+      </w:pPr>
+      <w:r>
+        <w:rPr>
+          <w:rFonts w:ascii="Arial" w:hAnsi="Arial"/>
+          <w:sz w:val="21"/>
+        </w:rPr>
+        <w:t>Confirm the Save licenses in folder. Generated files are normally saved in private-license-authority\issued.</w:t>
+      </w:r>
+    </w:p>
+    <w:p>
+      <w:pPr>
+        <w:pStyle w:val="ListNumber"/>
+        <w:spacing w:after="120"/>
+      </w:pPr>
+      <w:r>
+        <w:rPr>
+          <w:rFonts w:ascii="Arial" w:hAnsi="Arial"/>
+          <w:sz w:val="21"/>
+        </w:rPr>
+        <w:t>Press Generate signed license. A green confirmation displays the customer, meter capacity, License ID, and full file path.</w:t>
+      </w:r>
+    </w:p>
+    <w:p>
+      <w:r>
+        <w:rPr>
+          <w:rFonts w:ascii="Arial" w:hAnsi="Arial"/>
+          <w:b/>
+          <w:sz w:val="21"/>
+        </w:rPr>
+        <w:t xml:space="preserve">Shortcut help: </w:t>
+      </w:r>
+      <w:r>
+        <w:rPr>
+          <w:rFonts w:ascii="Arial" w:hAnsi="Arial"/>
+          <w:sz w:val="21"/>
+        </w:rPr>
+        <w:t>If the Desktop shortcut is missing, open the application directly from the following location:</w:t>
       </w:r>
     </w:p>
     <w:p>
@@ -593,46 +701,7 @@
           <w:rFonts w:ascii="Consolas" w:hAnsi="Consolas"/>
           <w:sz w:val="16"/>
         </w:rPr>
-        <w:t>cd C:\Users\Fady\Documents\Codex\2026-08-25\files-pasted-by-the-user-build</w:t>
-      </w:r>
-    </w:p>
-    <w:p>
-      <w:pPr>
-        <w:pStyle w:val="ListNumber"/>
-        <w:spacing w:after="120"/>
-      </w:pPr>
-      <w:r>
-        <w:rPr>
-          <w:rFonts w:ascii="Arial" w:hAnsi="Arial"/>
-          <w:sz w:val="21"/>
-        </w:rPr>
-        <w:t>Paste the complete generator command on one line. Replace the customer name and Installation ID with the real values:</w:t>
-      </w:r>
-    </w:p>
-    <w:p>
-      <w:pPr>
-        <w:spacing w:before="100" w:after="160"/>
-        <w:ind w:left="403" w:right="216"/>
-      </w:pPr>
-      <w:r>
-        <w:rPr>
-          <w:rFonts w:ascii="Consolas" w:hAnsi="Consolas"/>
-          <w:sz w:val="16"/>
-        </w:rPr>
-        <w:t>dotnet run --project tools\WatchdogLicenseGenerator -- issue --private private-license-authority\watchdog-license-private.pem --customer "Customer Mall Ltd" --installation "WD-XXXXX-XXXXX-XXXXX-XXXXX-XXXXX-XXXXX" --meters 50 --edition Commercial --out private-license-authority\issued\customer-mall.wdlicense</w:t>
-      </w:r>
-    </w:p>
-    <w:p>
-      <w:pPr>
-        <w:pStyle w:val="ListNumber"/>
-        <w:spacing w:after="120"/>
-      </w:pPr>
-      <w:r>
-        <w:rPr>
-          <w:rFonts w:ascii="Arial" w:hAnsi="Arial"/>
-          <w:sz w:val="21"/>
-        </w:rPr>
-        <w:t>Press Enter. A successful result displays the output file, customer, Installation ID, meter capacity, and License ID.</w:t>
+        <w:t>private-license-authority\WatchdogLicenseManager\Watchdog License Manager.exe</w:t>
       </w:r>
     </w:p>
     <w:p>
@@ -650,7 +719,7 @@
           <w:rFonts w:ascii="Arial" w:hAnsi="Arial"/>
           <w:sz w:val="21"/>
         </w:rPr>
-        <w:t>Use one of these values after the --meters option:</w:t>
+        <w:t>Select the capacity purchased by the customer:</w:t>
       </w:r>
     </w:p>
     <w:tbl>
@@ -691,7 +760,7 @@
                 <w:color w:val="FFFFFF"/>
                 <w:sz w:val="19"/>
               </w:rPr>
-              <w:t>Command value</w:t>
+              <w:t>Selected capacity</w:t>
             </w:r>
           </w:p>
         </w:tc>
@@ -737,7 +806,7 @@
                 <w:rFonts w:ascii="Arial" w:hAnsi="Arial"/>
                 <w:sz w:val="19"/>
               </w:rPr>
-              <w:t>--meters 50</w:t>
+              <w:t>50 meters</w:t>
             </w:r>
           </w:p>
         </w:tc>
@@ -781,7 +850,7 @@
                 <w:rFonts w:ascii="Arial" w:hAnsi="Arial"/>
                 <w:sz w:val="19"/>
               </w:rPr>
-              <w:t>--meters 100</w:t>
+              <w:t>100 meters</w:t>
             </w:r>
           </w:p>
         </w:tc>
@@ -825,7 +894,7 @@
                 <w:rFonts w:ascii="Arial" w:hAnsi="Arial"/>
                 <w:sz w:val="19"/>
               </w:rPr>
-              <w:t>--meters 150</w:t>
+              <w:t>150 meters</w:t>
             </w:r>
           </w:p>
         </w:tc>
@@ -869,7 +938,7 @@
                 <w:rFonts w:ascii="Arial" w:hAnsi="Arial"/>
                 <w:sz w:val="19"/>
               </w:rPr>
-              <w:t>--meters 200</w:t>
+              <w:t>200 meters</w:t>
             </w:r>
           </w:p>
         </w:tc>
@@ -920,20 +989,7 @@
           <w:rFonts w:ascii="Arial" w:hAnsi="Arial"/>
           <w:sz w:val="21"/>
         </w:rPr>
-        <w:t>Find the generated file in the output folder used in the command.</w:t>
-      </w:r>
-    </w:p>
-    <w:p>
-      <w:pPr>
-        <w:spacing w:before="100" w:after="160"/>
-        <w:ind w:left="403" w:right="216"/>
-      </w:pPr>
-      <w:r>
-        <w:rPr>
-          <w:rFonts w:ascii="Consolas" w:hAnsi="Consolas"/>
-          <w:sz w:val="16"/>
-        </w:rPr>
-        <w:t>private-license-authority\issued\customer-mall.wdlicense</w:t>
+        <w:t>Read the green confirmation and confirm the customer and meter capacity are correct.</w:t>
       </w:r>
     </w:p>
     <w:p>
@@ -946,20 +1002,7 @@
           <w:rFonts w:ascii="Arial" w:hAnsi="Arial"/>
           <w:sz w:val="21"/>
         </w:rPr>
-        <w:t>Optionally verify the signature before sending the file:</w:t>
-      </w:r>
-    </w:p>
-    <w:p>
-      <w:pPr>
-        <w:spacing w:before="100" w:after="160"/>
-        <w:ind w:left="403" w:right="216"/>
-      </w:pPr>
-      <w:r>
-        <w:rPr>
-          <w:rFonts w:ascii="Consolas" w:hAnsi="Consolas"/>
-          <w:sz w:val="16"/>
-        </w:rPr>
-        <w:t>dotnet run --project tools\WatchdogLicenseGenerator -- verify --public private-license-authority\watchdog-license-public.pem --license private-license-authority\issued\customer-mall.wdlicense</w:t>
+        <w:t>Press Open output folder to show the generated .wdlicense file.</w:t>
       </w:r>
     </w:p>
     <w:p>
@@ -972,7 +1015,20 @@
           <w:rFonts w:ascii="Arial" w:hAnsi="Arial"/>
           <w:sz w:val="21"/>
         </w:rPr>
-        <w:t>Confirm that the result says VALID ECDSA SIGNATURE and shows the correct customer, Installation ID, capacity, and expiry.</w:t>
+        <w:t>Press Verify license in Watchdog License Manager and select the new .wdlicense file.</w:t>
+      </w:r>
+    </w:p>
+    <w:p>
+      <w:pPr>
+        <w:pStyle w:val="ListNumber"/>
+        <w:spacing w:after="120"/>
+      </w:pPr>
+      <w:r>
+        <w:rPr>
+          <w:rFonts w:ascii="Arial" w:hAnsi="Arial"/>
+          <w:sz w:val="21"/>
+        </w:rPr>
+        <w:t>Confirm that the green verification message shows Valid ECDSA license, the correct customer, Installation ID, capacity, and expiry.</w:t>
       </w:r>
     </w:p>
     <w:p>
@@ -1509,7 +1565,7 @@
                 <w:b/>
                 <w:sz w:val="18"/>
               </w:rPr>
-              <w:t>PowerShell reports Missing expression after operator</w:t>
+              <w:t>Desktop shortcut is missing</w:t>
             </w:r>
           </w:p>
         </w:tc>
@@ -1531,7 +1587,99 @@
                 <w:rFonts w:ascii="Arial" w:hAnsi="Arial"/>
                 <w:sz w:val="18"/>
               </w:rPr>
-              <w:t>The command was entered beginning with an option such as --customer. Paste the full dotnet run command on one line.</w:t>
+              <w:t>Open private-license-authority\WatchdogLicenseManager and run Watchdog License Manager.exe. A new Desktop shortcut can also be created for this file.</w:t>
+            </w:r>
+          </w:p>
+        </w:tc>
+      </w:tr>
+      <w:tr>
+        <w:tc>
+          <w:tcPr>
+            <w:tcW w:type="dxa" w:w="3384"/>
+            <w:tcMar>
+              <w:top w:w="120" w:type="dxa"/>
+              <w:start w:w="140" w:type="dxa"/>
+              <w:bottom w:w="120" w:type="dxa"/>
+              <w:end w:w="140" w:type="dxa"/>
+            </w:tcMar>
+            <w:vAlign w:val="center"/>
+          </w:tcPr>
+          <w:p>
+            <w:r>
+              <w:rPr>
+                <w:rFonts w:ascii="Arial" w:hAnsi="Arial"/>
+                <w:b/>
+                <w:sz w:val="18"/>
+              </w:rPr>
+              <w:t>Private key was not found</w:t>
+            </w:r>
+          </w:p>
+        </w:tc>
+        <w:tc>
+          <w:tcPr>
+            <w:tcW w:type="dxa" w:w="6408"/>
+            <w:tcMar>
+              <w:top w:w="120" w:type="dxa"/>
+              <w:start w:w="140" w:type="dxa"/>
+              <w:bottom w:w="120" w:type="dxa"/>
+              <w:end w:w="140" w:type="dxa"/>
+            </w:tcMar>
+            <w:vAlign w:val="center"/>
+          </w:tcPr>
+          <w:p>
+            <w:r>
+              <w:rPr>
+                <w:rFonts w:ascii="Arial" w:hAnsi="Arial"/>
+                <w:sz w:val="18"/>
+              </w:rPr>
+              <w:t>Press Browse beside Private key and select private-license-authority\watchdog-license-private.pem on the protected MicroBrain PC.</w:t>
+            </w:r>
+          </w:p>
+        </w:tc>
+      </w:tr>
+      <w:tr>
+        <w:tc>
+          <w:tcPr>
+            <w:tcW w:type="dxa" w:w="3384"/>
+            <w:shd w:fill="F5F8F9"/>
+            <w:tcMar>
+              <w:top w:w="120" w:type="dxa"/>
+              <w:start w:w="140" w:type="dxa"/>
+              <w:bottom w:w="120" w:type="dxa"/>
+              <w:end w:w="140" w:type="dxa"/>
+            </w:tcMar>
+            <w:vAlign w:val="center"/>
+          </w:tcPr>
+          <w:p>
+            <w:r>
+              <w:rPr>
+                <w:rFonts w:ascii="Arial" w:hAnsi="Arial"/>
+                <w:b/>
+                <w:sz w:val="18"/>
+              </w:rPr>
+              <w:t>Generate button reports an invalid Installation ID</w:t>
+            </w:r>
+          </w:p>
+        </w:tc>
+        <w:tc>
+          <w:tcPr>
+            <w:tcW w:type="dxa" w:w="6408"/>
+            <w:shd w:fill="F5F8F9"/>
+            <w:tcMar>
+              <w:top w:w="120" w:type="dxa"/>
+              <w:start w:w="140" w:type="dxa"/>
+              <w:bottom w:w="120" w:type="dxa"/>
+              <w:end w:w="140" w:type="dxa"/>
+            </w:tcMar>
+            <w:vAlign w:val="center"/>
+          </w:tcPr>
+          <w:p>
+            <w:r>
+              <w:rPr>
+                <w:rFonts w:ascii="Arial" w:hAnsi="Arial"/>
+                <w:sz w:val="18"/>
+              </w:rPr>
+              <w:t>Copy the Installation ID again from the customer's Settings and License page. Paste the complete WD code without changing any character.</w:t>
             </w:r>
           </w:p>
         </w:tc>

</xml_diff>